<commit_message>
Update CV website content
</commit_message>
<xml_diff>
--- a/assets/current-cv.docx
+++ b/assets/current-cv.docx
@@ -24,47 +24,7 @@
           <w:sz w:val="34"/>
           <w:szCs w:val="34"/>
         </w:rPr>
-        <w:t>T</w:t>
-      </w:r>
-      <w:r>
-        <w:rPr>
-          <w:rFonts w:eastAsia="Times New Roman" w:cs="Times New Roman" w:ascii="Times New Roman" w:hAnsi="Times New Roman"/>
-          <w:b/>
-          <w:bCs/>
-          <w:sz w:val="34"/>
-          <w:szCs w:val="34"/>
-        </w:rPr>
-        <w:t>r</w:t>
-      </w:r>
-      <w:r>
-        <w:rPr>
-          <w:rFonts w:eastAsia="Times New Roman" w:cs="Times New Roman" w:ascii="Times New Roman" w:hAnsi="Times New Roman"/>
-          <w:b/>
-          <w:bCs/>
-          <w:sz w:val="34"/>
-          <w:szCs w:val="34"/>
-        </w:rPr>
-        <w:t>e</w:t>
-      </w:r>
-      <w:r>
-        <w:rPr>
-          <w:rFonts w:eastAsia="Times New Roman" w:cs="Times New Roman" w:ascii="Times New Roman" w:hAnsi="Times New Roman"/>
-          <w:b/>
-          <w:bCs/>
-          <w:sz w:val="34"/>
-          <w:szCs w:val="34"/>
-        </w:rPr>
-        <w:t>nt</w:t>
-      </w:r>
-      <w:r>
-        <w:rPr>
-          <w:rFonts w:eastAsia="Times New Roman" w:cs="Times New Roman" w:ascii="Times New Roman" w:hAnsi="Times New Roman"/>
-          <w:b/>
-          <w:bCs/>
-          <w:sz w:val="34"/>
-          <w:szCs w:val="34"/>
-        </w:rPr>
-        <w:t xml:space="preserve"> W. Dawson, Ph.D.</w:t>
+        <w:t>Trent W. Dawson, Ph.D.</w:t>
       </w:r>
     </w:p>
     <w:p>
@@ -2516,7 +2476,7 @@
       <w:pPr>
         <w:pStyle w:val="Normal"/>
         <w:spacing w:lineRule="auto" w:line="240"/>
-        <w:ind w:start="720" w:end="180"/>
+        <w:ind w:hanging="360" w:start="360" w:end="180"/>
         <w:rPr>
           <w:rFonts w:ascii="Times New Roman" w:hAnsi="Times New Roman" w:eastAsia="Times New Roman" w:cs="Times New Roman"/>
           <w:i/>
@@ -2542,109 +2502,141 @@
         <w:ind w:hanging="360" w:start="360" w:end="180"/>
         <w:rPr>
           <w:rFonts w:ascii="Times New Roman" w:hAnsi="Times New Roman" w:eastAsia="Times New Roman" w:cs="Times New Roman"/>
+          <w:sz w:val="24"/>
+          <w:szCs w:val="24"/>
+        </w:rPr>
+      </w:pPr>
+      <w:r>
+        <w:rPr>
+          <w:rFonts w:eastAsia="Times New Roman" w:cs="Times New Roman" w:ascii="Times New Roman" w:hAnsi="Times New Roman"/>
+          <w:sz w:val="24"/>
+          <w:szCs w:val="24"/>
+        </w:rPr>
+        <w:t xml:space="preserve">[3] </w:t>
+      </w:r>
+      <w:r>
+        <w:rPr>
+          <w:rFonts w:eastAsia="Times New Roman" w:cs="Times New Roman" w:ascii="Times New Roman" w:hAnsi="Times New Roman"/>
+          <w:b/>
+          <w:bCs/>
+          <w:sz w:val="24"/>
+          <w:szCs w:val="24"/>
+        </w:rPr>
+        <w:t>Dawson, T.W.</w:t>
+      </w:r>
+      <w:r>
+        <w:rPr>
+          <w:rFonts w:eastAsia="Times New Roman" w:cs="Times New Roman" w:ascii="Times New Roman" w:hAnsi="Times New Roman"/>
+          <w:sz w:val="24"/>
+          <w:szCs w:val="24"/>
+        </w:rPr>
+        <w:t xml:space="preserve">, Butler, M., &amp; Fasching-Varner, K.J. (revise &amp; resubmit). What counts as competent teaching? A systematic narrative synthesis of teacher competencies in K–12 education. </w:t>
+      </w:r>
+      <w:r>
+        <w:rPr>
+          <w:rFonts w:eastAsia="Times New Roman" w:cs="Times New Roman" w:ascii="Times New Roman" w:hAnsi="Times New Roman"/>
           <w:i/>
           <w:iCs/>
           <w:sz w:val="24"/>
           <w:szCs w:val="24"/>
         </w:rPr>
-      </w:pPr>
-      <w:r>
-        <w:rPr>
-          <w:rFonts w:eastAsia="Times New Roman" w:cs="Times New Roman" w:ascii="Times New Roman" w:hAnsi="Times New Roman"/>
-          <w:sz w:val="24"/>
-          <w:szCs w:val="24"/>
-        </w:rPr>
-        <w:t>[4]</w:t>
-      </w:r>
-      <w:r>
-        <w:rPr>
-          <w:rFonts w:eastAsia="Times New Roman" w:cs="Times New Roman" w:ascii="Times New Roman" w:hAnsi="Times New Roman"/>
-          <w:b/>
-          <w:bCs/>
-          <w:sz w:val="24"/>
-          <w:szCs w:val="24"/>
-        </w:rPr>
-        <w:t xml:space="preserve"> Dawson, T.W.</w:t>
-      </w:r>
-      <w:r>
-        <w:rPr>
-          <w:rFonts w:eastAsia="Times New Roman" w:cs="Times New Roman" w:ascii="Times New Roman" w:hAnsi="Times New Roman"/>
-          <w:sz w:val="24"/>
-          <w:szCs w:val="24"/>
-        </w:rPr>
-        <w:t xml:space="preserve">, Joswick, C., Tobin, K., &amp; Karadimou, O. (in press). Exploring community college students’ perceptions of computer science: A pilot study of adapted computing attitudes surveys. </w:t>
-      </w:r>
-      <w:r>
-        <w:rPr>
-          <w:rFonts w:eastAsia="Times New Roman" w:cs="Times New Roman" w:ascii="Times New Roman" w:hAnsi="Times New Roman"/>
+        <w:t>Teaching and Teacher Education</w:t>
+      </w:r>
+      <w:r>
+        <w:rPr>
+          <w:rFonts w:eastAsia="Times New Roman" w:cs="Times New Roman" w:ascii="Times New Roman" w:hAnsi="Times New Roman"/>
+          <w:sz w:val="24"/>
+          <w:szCs w:val="24"/>
+        </w:rPr>
+        <w:t>.</w:t>
+      </w:r>
+    </w:p>
+    <w:p>
+      <w:pPr>
+        <w:pStyle w:val="Normal"/>
+        <w:spacing w:lineRule="auto" w:line="240"/>
+        <w:ind w:hanging="360" w:start="360" w:end="180"/>
+        <w:rPr>
+          <w:rFonts w:ascii="Times New Roman" w:hAnsi="Times New Roman" w:eastAsia="Times New Roman" w:cs="Times New Roman"/>
+          <w:b/>
+          <w:bCs/>
+          <w:sz w:val="24"/>
+          <w:szCs w:val="24"/>
+        </w:rPr>
+      </w:pPr>
+      <w:r>
+        <w:rPr>
+          <w:rFonts w:eastAsia="Times New Roman" w:cs="Times New Roman" w:ascii="Times New Roman" w:hAnsi="Times New Roman"/>
+          <w:b/>
+          <w:bCs/>
+          <w:sz w:val="24"/>
+          <w:szCs w:val="24"/>
+        </w:rPr>
+      </w:r>
+    </w:p>
+    <w:p>
+      <w:pPr>
+        <w:pStyle w:val="Normal"/>
+        <w:spacing w:lineRule="auto" w:line="240"/>
+        <w:ind w:hanging="360" w:start="360" w:end="180"/>
+        <w:rPr>
+          <w:rFonts w:ascii="Times New Roman" w:hAnsi="Times New Roman" w:eastAsia="Times New Roman" w:cs="Times New Roman"/>
           <w:i/>
           <w:iCs/>
           <w:sz w:val="24"/>
           <w:szCs w:val="24"/>
         </w:rPr>
-        <w:t>Community College Enterprise.</w:t>
-      </w:r>
-    </w:p>
-    <w:p>
-      <w:pPr>
-        <w:pStyle w:val="Normal"/>
-        <w:spacing w:lineRule="auto" w:line="240"/>
-        <w:ind w:hanging="360" w:start="360" w:end="180"/>
-        <w:rPr>
-          <w:rFonts w:ascii="Times New Roman" w:hAnsi="Times New Roman" w:eastAsia="Times New Roman" w:cs="Times New Roman"/>
+      </w:pPr>
+      <w:r>
+        <w:rPr>
+          <w:rFonts w:eastAsia="Times New Roman" w:cs="Times New Roman" w:ascii="Times New Roman" w:hAnsi="Times New Roman"/>
+          <w:sz w:val="24"/>
+          <w:szCs w:val="24"/>
+        </w:rPr>
+        <w:t>[2]</w:t>
+      </w:r>
+      <w:r>
+        <w:rPr>
+          <w:rFonts w:eastAsia="Times New Roman" w:cs="Times New Roman" w:ascii="Times New Roman" w:hAnsi="Times New Roman"/>
+          <w:b/>
+          <w:bCs/>
+          <w:sz w:val="24"/>
+          <w:szCs w:val="24"/>
+        </w:rPr>
+        <w:t xml:space="preserve"> Dawson, T.W.</w:t>
+      </w:r>
+      <w:r>
+        <w:rPr>
+          <w:rFonts w:eastAsia="Times New Roman" w:cs="Times New Roman" w:ascii="Times New Roman" w:hAnsi="Times New Roman"/>
+          <w:sz w:val="24"/>
+          <w:szCs w:val="24"/>
+        </w:rPr>
+        <w:t xml:space="preserve">, Hack, M., Fasching-Varner, K.J. (revise and resubmit). Evaluating an online orientation within an apprenticeship teacher preparation pathway: Initial evidence of student satisfaction and preparedness. </w:t>
+      </w:r>
+      <w:r>
+        <w:rPr>
+          <w:rFonts w:eastAsia="Times New Roman" w:cs="Times New Roman" w:ascii="Times New Roman" w:hAnsi="Times New Roman"/>
           <w:i/>
           <w:iCs/>
           <w:sz w:val="24"/>
           <w:szCs w:val="24"/>
         </w:rPr>
-      </w:pPr>
-      <w:r>
-        <w:rPr>
-          <w:rFonts w:eastAsia="Times New Roman" w:cs="Times New Roman" w:ascii="Times New Roman" w:hAnsi="Times New Roman"/>
+        <w:t xml:space="preserve">The Journal of Continuing Higher Education. </w:t>
+      </w:r>
+    </w:p>
+    <w:p>
+      <w:pPr>
+        <w:pStyle w:val="Normal"/>
+        <w:spacing w:lineRule="auto" w:line="240"/>
+        <w:ind w:hanging="360" w:start="360" w:end="180"/>
+        <w:rPr>
+          <w:rFonts w:ascii="Times New Roman" w:hAnsi="Times New Roman" w:eastAsia="Times New Roman" w:cs="Times New Roman"/>
           <w:i/>
           <w:iCs/>
           <w:sz w:val="24"/>
           <w:szCs w:val="24"/>
         </w:rPr>
-      </w:r>
-    </w:p>
-    <w:p>
-      <w:pPr>
-        <w:pStyle w:val="Normal"/>
-        <w:spacing w:lineRule="auto" w:line="240"/>
-        <w:ind w:hanging="360" w:start="360" w:end="180"/>
-        <w:rPr>
-          <w:rFonts w:ascii="Times New Roman" w:hAnsi="Times New Roman" w:eastAsia="Times New Roman" w:cs="Times New Roman"/>
-          <w:sz w:val="24"/>
-          <w:szCs w:val="24"/>
-        </w:rPr>
-      </w:pPr>
-      <w:r>
-        <w:rPr>
-          <w:rFonts w:eastAsia="Times New Roman" w:cs="Times New Roman" w:ascii="Times New Roman" w:hAnsi="Times New Roman"/>
-          <w:sz w:val="24"/>
-          <w:szCs w:val="24"/>
-        </w:rPr>
-        <w:t xml:space="preserve">[3] </w:t>
-      </w:r>
-      <w:r>
-        <w:rPr>
-          <w:rFonts w:eastAsia="Times New Roman" w:cs="Times New Roman" w:ascii="Times New Roman" w:hAnsi="Times New Roman"/>
-          <w:b/>
-          <w:bCs/>
-          <w:sz w:val="24"/>
-          <w:szCs w:val="24"/>
-        </w:rPr>
-        <w:t>Dawson, T.W.</w:t>
-      </w:r>
-      <w:r>
-        <w:rPr>
-          <w:rFonts w:eastAsia="Times New Roman" w:cs="Times New Roman" w:ascii="Times New Roman" w:hAnsi="Times New Roman"/>
-          <w:sz w:val="24"/>
-          <w:szCs w:val="24"/>
-        </w:rPr>
-        <w:t xml:space="preserve">, Butler, M., &amp; Fasching-Varner, K.J. (revise &amp; resubmit). What counts as competent teaching? A systematic narrative synthesis of teacher competencies in K–12 education. </w:t>
-      </w:r>
+      </w:pPr>
       <w:r>
         <w:rPr>
           <w:rFonts w:eastAsia="Times New Roman" w:cs="Times New Roman" w:ascii="Times New Roman" w:hAnsi="Times New Roman"/>
@@ -2653,38 +2645,6 @@
           <w:sz w:val="24"/>
           <w:szCs w:val="24"/>
         </w:rPr>
-        <w:t>Teaching and Teacher Education</w:t>
-      </w:r>
-      <w:r>
-        <w:rPr>
-          <w:rFonts w:eastAsia="Times New Roman" w:cs="Times New Roman" w:ascii="Times New Roman" w:hAnsi="Times New Roman"/>
-          <w:sz w:val="24"/>
-          <w:szCs w:val="24"/>
-        </w:rPr>
-        <w:t>.</w:t>
-      </w:r>
-    </w:p>
-    <w:p>
-      <w:pPr>
-        <w:pStyle w:val="Normal"/>
-        <w:spacing w:lineRule="auto" w:line="240"/>
-        <w:ind w:hanging="360" w:start="360" w:end="180"/>
-        <w:rPr>
-          <w:rFonts w:ascii="Times New Roman" w:hAnsi="Times New Roman" w:eastAsia="Times New Roman" w:cs="Times New Roman"/>
-          <w:b/>
-          <w:bCs/>
-          <w:sz w:val="24"/>
-          <w:szCs w:val="24"/>
-        </w:rPr>
-      </w:pPr>
-      <w:r>
-        <w:rPr>
-          <w:rFonts w:eastAsia="Times New Roman" w:cs="Times New Roman" w:ascii="Times New Roman" w:hAnsi="Times New Roman"/>
-          <w:b/>
-          <w:bCs/>
-          <w:sz w:val="24"/>
-          <w:szCs w:val="24"/>
-        </w:rPr>
       </w:r>
     </w:p>
     <w:p>
@@ -2706,25 +2666,25 @@
           <w:sz w:val="24"/>
           <w:szCs w:val="24"/>
         </w:rPr>
-        <w:t>[2]</w:t>
-      </w:r>
-      <w:r>
-        <w:rPr>
-          <w:rFonts w:eastAsia="Times New Roman" w:cs="Times New Roman" w:ascii="Times New Roman" w:hAnsi="Times New Roman"/>
-          <w:b/>
-          <w:bCs/>
-          <w:sz w:val="24"/>
-          <w:szCs w:val="24"/>
-        </w:rPr>
-        <w:t xml:space="preserve"> Dawson, T.W.</w:t>
-      </w:r>
-      <w:r>
-        <w:rPr>
-          <w:rFonts w:eastAsia="Times New Roman" w:cs="Times New Roman" w:ascii="Times New Roman" w:hAnsi="Times New Roman"/>
-          <w:sz w:val="24"/>
-          <w:szCs w:val="24"/>
-        </w:rPr>
-        <w:t xml:space="preserve">, Hack, M., Fasching-Varner, K.J. (revise and resubmit). Evaluating an online orientation within an apprenticeship teacher preparation pathway: Initial evidence of student satisfaction and preparedness. </w:t>
+        <w:t xml:space="preserve">[1] </w:t>
+      </w:r>
+      <w:r>
+        <w:rPr>
+          <w:rFonts w:eastAsia="Times New Roman" w:cs="Times New Roman" w:ascii="Times New Roman" w:hAnsi="Times New Roman"/>
+          <w:b/>
+          <w:bCs/>
+          <w:sz w:val="24"/>
+          <w:szCs w:val="24"/>
+        </w:rPr>
+        <w:t>Dawson, T. W.</w:t>
+      </w:r>
+      <w:r>
+        <w:rPr>
+          <w:rFonts w:eastAsia="Times New Roman" w:cs="Times New Roman" w:ascii="Times New Roman" w:hAnsi="Times New Roman"/>
+          <w:sz w:val="24"/>
+          <w:szCs w:val="24"/>
+        </w:rPr>
+        <w:t xml:space="preserve">, Hoffman, A., Sahin, B., &amp; Fasching-Varner, K. J. (out for review). Program support and preservice teacher self-efficacy: A causal-comparative analysis of traditional and apprenticeship preparation pathways. </w:t>
       </w:r>
       <w:r>
         <w:rPr>
@@ -2734,7 +2694,74 @@
           <w:sz w:val="24"/>
           <w:szCs w:val="24"/>
         </w:rPr>
-        <w:t xml:space="preserve">The Journal of Continuing Higher Education. </w:t>
+        <w:t>Action in Teacher Education</w:t>
+      </w:r>
+    </w:p>
+    <w:p>
+      <w:pPr>
+        <w:pStyle w:val="Normal"/>
+        <w:spacing w:lineRule="auto" w:line="240"/>
+        <w:rPr>
+          <w:rFonts w:ascii="Times New Roman" w:hAnsi="Times New Roman" w:eastAsia="Times New Roman" w:cs="Times New Roman"/>
+          <w:b/>
+          <w:bCs/>
+          <w:sz w:val="24"/>
+          <w:szCs w:val="24"/>
+        </w:rPr>
+      </w:pPr>
+      <w:r>
+        <w:rPr>
+          <w:rFonts w:eastAsia="Times New Roman" w:cs="Times New Roman" w:ascii="Times New Roman" w:hAnsi="Times New Roman"/>
+          <w:b/>
+          <w:bCs/>
+          <w:sz w:val="24"/>
+          <w:szCs w:val="24"/>
+        </w:rPr>
+      </w:r>
+    </w:p>
+    <w:p>
+      <w:pPr>
+        <w:pStyle w:val="Normal"/>
+        <w:spacing w:lineRule="auto" w:line="240"/>
+        <w:rPr>
+          <w:rFonts w:ascii="Times New Roman" w:hAnsi="Times New Roman" w:eastAsia="Times New Roman" w:cs="Times New Roman"/>
+          <w:b/>
+          <w:bCs/>
+          <w:sz w:val="24"/>
+          <w:szCs w:val="24"/>
+        </w:rPr>
+      </w:pPr>
+      <w:r>
+        <w:rPr>
+          <w:rFonts w:eastAsia="Times New Roman" w:cs="Times New Roman" w:ascii="Times New Roman" w:hAnsi="Times New Roman"/>
+          <w:b/>
+          <w:bCs/>
+          <w:sz w:val="24"/>
+          <w:szCs w:val="24"/>
+        </w:rPr>
+        <w:t>Peer-Reviewed Journal Articles in Preparation</w:t>
+      </w:r>
+    </w:p>
+    <w:p>
+      <w:pPr>
+        <w:pStyle w:val="Normal"/>
+        <w:spacing w:lineRule="auto" w:line="240"/>
+        <w:rPr>
+          <w:rFonts w:ascii="Times New Roman" w:hAnsi="Times New Roman" w:eastAsia="Times New Roman" w:cs="Times New Roman"/>
+          <w:b/>
+          <w:bCs/>
+          <w:sz w:val="24"/>
+          <w:szCs w:val="24"/>
+        </w:rPr>
+      </w:pPr>
+      <w:r>
+        <w:rPr>
+          <w:rFonts w:eastAsia="Times New Roman" w:cs="Times New Roman" w:ascii="Times New Roman" w:hAnsi="Times New Roman"/>
+          <w:b/>
+          <w:bCs/>
+          <w:sz w:val="24"/>
+          <w:szCs w:val="24"/>
+        </w:rPr>
       </w:r>
     </w:p>
     <w:p>
@@ -2744,20 +2771,35 @@
         <w:ind w:hanging="360" w:start="360" w:end="180"/>
         <w:rPr>
           <w:rFonts w:ascii="Times New Roman" w:hAnsi="Times New Roman" w:eastAsia="Times New Roman" w:cs="Times New Roman"/>
-          <w:i/>
-          <w:iCs/>
-          <w:sz w:val="24"/>
-          <w:szCs w:val="24"/>
-        </w:rPr>
-      </w:pPr>
-      <w:r>
-        <w:rPr>
-          <w:rFonts w:eastAsia="Times New Roman" w:cs="Times New Roman" w:ascii="Times New Roman" w:hAnsi="Times New Roman"/>
-          <w:i/>
-          <w:iCs/>
-          <w:sz w:val="24"/>
-          <w:szCs w:val="24"/>
-        </w:rPr>
+          <w:sz w:val="24"/>
+          <w:szCs w:val="24"/>
+        </w:rPr>
+      </w:pPr>
+      <w:r>
+        <w:rPr>
+          <w:rFonts w:eastAsia="Times New Roman" w:cs="Times New Roman" w:ascii="Times New Roman" w:hAnsi="Times New Roman"/>
+          <w:sz w:val="24"/>
+          <w:szCs w:val="24"/>
+        </w:rPr>
+        <w:t xml:space="preserve">[2] Hoffman, A., Hack, M., </w:t>
+      </w:r>
+      <w:r>
+        <w:rPr>
+          <w:rFonts w:eastAsia="Times New Roman" w:cs="Times New Roman" w:ascii="Times New Roman" w:hAnsi="Times New Roman"/>
+          <w:b/>
+          <w:bCs/>
+          <w:sz w:val="24"/>
+          <w:szCs w:val="24"/>
+        </w:rPr>
+        <w:t>Dawson, T. W.</w:t>
+      </w:r>
+      <w:r>
+        <w:rPr>
+          <w:rFonts w:eastAsia="Times New Roman" w:cs="Times New Roman" w:ascii="Times New Roman" w:hAnsi="Times New Roman"/>
+          <w:sz w:val="24"/>
+          <w:szCs w:val="24"/>
+        </w:rPr>
+        <w:t xml:space="preserve">, &amp; Fasching-Varner, K. J. (in preparation). Comparative analysis of start timing on satisfaction in an online asynchronous orientation. </w:t>
       </w:r>
     </w:p>
     <w:p>
@@ -2767,111 +2809,13 @@
         <w:ind w:hanging="360" w:start="360" w:end="180"/>
         <w:rPr>
           <w:rFonts w:ascii="Times New Roman" w:hAnsi="Times New Roman" w:eastAsia="Times New Roman" w:cs="Times New Roman"/>
-          <w:i/>
-          <w:iCs/>
-          <w:sz w:val="24"/>
-          <w:szCs w:val="24"/>
-        </w:rPr>
-      </w:pPr>
-      <w:r>
-        <w:rPr>
-          <w:rFonts w:eastAsia="Times New Roman" w:cs="Times New Roman" w:ascii="Times New Roman" w:hAnsi="Times New Roman"/>
-          <w:sz w:val="24"/>
-          <w:szCs w:val="24"/>
-        </w:rPr>
-        <w:t xml:space="preserve">[1] </w:t>
-      </w:r>
-      <w:r>
-        <w:rPr>
-          <w:rFonts w:eastAsia="Times New Roman" w:cs="Times New Roman" w:ascii="Times New Roman" w:hAnsi="Times New Roman"/>
-          <w:b/>
-          <w:bCs/>
-          <w:sz w:val="24"/>
-          <w:szCs w:val="24"/>
-        </w:rPr>
-        <w:t>Dawson, T. W.</w:t>
-      </w:r>
-      <w:r>
-        <w:rPr>
-          <w:rFonts w:eastAsia="Times New Roman" w:cs="Times New Roman" w:ascii="Times New Roman" w:hAnsi="Times New Roman"/>
-          <w:sz w:val="24"/>
-          <w:szCs w:val="24"/>
-        </w:rPr>
-        <w:t xml:space="preserve">, Hoffman, A., Sahin, B., &amp; Fasching-Varner, K. J. (out for review). Program support and preservice teacher self-efficacy: A causal-comparative analysis of traditional and apprenticeship preparation pathways. </w:t>
-      </w:r>
-      <w:r>
-        <w:rPr>
-          <w:rFonts w:eastAsia="Times New Roman" w:cs="Times New Roman" w:ascii="Times New Roman" w:hAnsi="Times New Roman"/>
-          <w:i/>
-          <w:iCs/>
-          <w:sz w:val="24"/>
-          <w:szCs w:val="24"/>
-        </w:rPr>
-        <w:t>Action in Teacher Education</w:t>
-      </w:r>
-    </w:p>
-    <w:p>
-      <w:pPr>
-        <w:pStyle w:val="Normal"/>
-        <w:spacing w:lineRule="auto" w:line="240"/>
-        <w:rPr>
-          <w:rFonts w:ascii="Times New Roman" w:hAnsi="Times New Roman" w:eastAsia="Times New Roman" w:cs="Times New Roman"/>
-          <w:b/>
-          <w:bCs/>
-          <w:sz w:val="24"/>
-          <w:szCs w:val="24"/>
-        </w:rPr>
-      </w:pPr>
-      <w:r>
-        <w:rPr>
-          <w:rFonts w:eastAsia="Times New Roman" w:cs="Times New Roman" w:ascii="Times New Roman" w:hAnsi="Times New Roman"/>
-          <w:b/>
-          <w:bCs/>
-          <w:sz w:val="24"/>
-          <w:szCs w:val="24"/>
-        </w:rPr>
-      </w:r>
-    </w:p>
-    <w:p>
-      <w:pPr>
-        <w:pStyle w:val="Normal"/>
-        <w:spacing w:lineRule="auto" w:line="240"/>
-        <w:rPr>
-          <w:rFonts w:ascii="Times New Roman" w:hAnsi="Times New Roman" w:eastAsia="Times New Roman" w:cs="Times New Roman"/>
-          <w:b/>
-          <w:bCs/>
-          <w:sz w:val="24"/>
-          <w:szCs w:val="24"/>
-        </w:rPr>
-      </w:pPr>
-      <w:r>
-        <w:rPr>
-          <w:rFonts w:eastAsia="Times New Roman" w:cs="Times New Roman" w:ascii="Times New Roman" w:hAnsi="Times New Roman"/>
-          <w:b/>
-          <w:bCs/>
-          <w:sz w:val="24"/>
-          <w:szCs w:val="24"/>
-        </w:rPr>
-        <w:t>Peer-Reviewed Journal Articles in Preparation</w:t>
-      </w:r>
-    </w:p>
-    <w:p>
-      <w:pPr>
-        <w:pStyle w:val="Normal"/>
-        <w:spacing w:lineRule="auto" w:line="240"/>
-        <w:rPr>
-          <w:rFonts w:ascii="Times New Roman" w:hAnsi="Times New Roman" w:eastAsia="Times New Roman" w:cs="Times New Roman"/>
-          <w:b/>
-          <w:bCs/>
-          <w:sz w:val="24"/>
-          <w:szCs w:val="24"/>
-        </w:rPr>
-      </w:pPr>
-      <w:r>
-        <w:rPr>
-          <w:rFonts w:eastAsia="Times New Roman" w:cs="Times New Roman" w:ascii="Times New Roman" w:hAnsi="Times New Roman"/>
-          <w:b/>
-          <w:bCs/>
+          <w:sz w:val="24"/>
+          <w:szCs w:val="24"/>
+        </w:rPr>
+      </w:pPr>
+      <w:r>
+        <w:rPr>
+          <w:rFonts w:eastAsia="Times New Roman" w:cs="Times New Roman" w:ascii="Times New Roman" w:hAnsi="Times New Roman"/>
           <w:sz w:val="24"/>
           <w:szCs w:val="24"/>
         </w:rPr>
@@ -2894,63 +2838,6 @@
           <w:sz w:val="24"/>
           <w:szCs w:val="24"/>
         </w:rPr>
-        <w:t xml:space="preserve">[2] Hoffman, A., Hack, M., </w:t>
-      </w:r>
-      <w:r>
-        <w:rPr>
-          <w:rFonts w:eastAsia="Times New Roman" w:cs="Times New Roman" w:ascii="Times New Roman" w:hAnsi="Times New Roman"/>
-          <w:b/>
-          <w:bCs/>
-          <w:sz w:val="24"/>
-          <w:szCs w:val="24"/>
-        </w:rPr>
-        <w:t>Dawson, T. W.</w:t>
-      </w:r>
-      <w:r>
-        <w:rPr>
-          <w:rFonts w:eastAsia="Times New Roman" w:cs="Times New Roman" w:ascii="Times New Roman" w:hAnsi="Times New Roman"/>
-          <w:sz w:val="24"/>
-          <w:szCs w:val="24"/>
-        </w:rPr>
-        <w:t xml:space="preserve">, &amp; Fasching-Varner, K. J. (in preparation). Comparative analysis of start timing on satisfaction in an online asynchronous orientation. </w:t>
-      </w:r>
-    </w:p>
-    <w:p>
-      <w:pPr>
-        <w:pStyle w:val="Normal"/>
-        <w:spacing w:lineRule="auto" w:line="240"/>
-        <w:ind w:hanging="360" w:start="360" w:end="180"/>
-        <w:rPr>
-          <w:rFonts w:ascii="Times New Roman" w:hAnsi="Times New Roman" w:eastAsia="Times New Roman" w:cs="Times New Roman"/>
-          <w:sz w:val="24"/>
-          <w:szCs w:val="24"/>
-        </w:rPr>
-      </w:pPr>
-      <w:r>
-        <w:rPr>
-          <w:rFonts w:eastAsia="Times New Roman" w:cs="Times New Roman" w:ascii="Times New Roman" w:hAnsi="Times New Roman"/>
-          <w:sz w:val="24"/>
-          <w:szCs w:val="24"/>
-        </w:rPr>
-      </w:r>
-    </w:p>
-    <w:p>
-      <w:pPr>
-        <w:pStyle w:val="Normal"/>
-        <w:spacing w:lineRule="auto" w:line="240"/>
-        <w:ind w:hanging="360" w:start="360" w:end="180"/>
-        <w:rPr>
-          <w:rFonts w:ascii="Times New Roman" w:hAnsi="Times New Roman" w:eastAsia="Times New Roman" w:cs="Times New Roman"/>
-          <w:sz w:val="24"/>
-          <w:szCs w:val="24"/>
-        </w:rPr>
-      </w:pPr>
-      <w:r>
-        <w:rPr>
-          <w:rFonts w:eastAsia="Times New Roman" w:cs="Times New Roman" w:ascii="Times New Roman" w:hAnsi="Times New Roman"/>
-          <w:sz w:val="24"/>
-          <w:szCs w:val="24"/>
-        </w:rPr>
         <w:t xml:space="preserve">[1] Salguero, M., </w:t>
       </w:r>
       <w:r>
@@ -2993,8 +2880,53 @@
           <w:sz w:val="24"/>
           <w:szCs w:val="24"/>
         </w:rPr>
-        <w:br/>
+      </w:r>
+    </w:p>
+    <w:p>
+      <w:pPr>
+        <w:pStyle w:val="Normal"/>
+        <w:spacing w:lineRule="auto" w:line="240"/>
+        <w:rPr>
+          <w:rFonts w:ascii="Times New Roman" w:hAnsi="Times New Roman" w:eastAsia="Times New Roman" w:cs="Times New Roman"/>
+          <w:b/>
+          <w:bCs/>
+          <w:smallCaps/>
+          <w:sz w:val="24"/>
+          <w:szCs w:val="24"/>
+        </w:rPr>
+      </w:pPr>
+      <w:r>
+        <w:rPr>
+          <w:rFonts w:eastAsia="Times New Roman" w:cs="Times New Roman" w:ascii="Times New Roman" w:hAnsi="Times New Roman"/>
+          <w:b/>
+          <w:bCs/>
+          <w:sz w:val="24"/>
+          <w:szCs w:val="24"/>
+        </w:rPr>
         <w:t>Peer-Reviewed Conference Presentations</w:t>
+      </w:r>
+    </w:p>
+    <w:p>
+      <w:pPr>
+        <w:pStyle w:val="Normal"/>
+        <w:spacing w:lineRule="auto" w:line="240"/>
+        <w:rPr>
+          <w:rFonts w:ascii="Times New Roman" w:hAnsi="Times New Roman" w:eastAsia="Times New Roman" w:cs="Times New Roman"/>
+          <w:b/>
+          <w:bCs/>
+          <w:smallCaps/>
+          <w:sz w:val="24"/>
+          <w:szCs w:val="24"/>
+        </w:rPr>
+      </w:pPr>
+      <w:r>
+        <w:rPr>
+          <w:rFonts w:eastAsia="Times New Roman" w:cs="Times New Roman" w:ascii="Times New Roman" w:hAnsi="Times New Roman"/>
+          <w:b/>
+          <w:bCs/>
+          <w:sz w:val="24"/>
+          <w:szCs w:val="24"/>
+        </w:rPr>
       </w:r>
     </w:p>
     <w:p>
@@ -3014,6 +2946,133 @@
           <w:sz w:val="24"/>
           <w:szCs w:val="24"/>
         </w:rPr>
+        <w:t>[2</w:t>
+      </w:r>
+      <w:r>
+        <w:rPr>
+          <w:rFonts w:eastAsia="Times New Roman" w:cs="Times New Roman" w:ascii="Times New Roman" w:hAnsi="Times New Roman"/>
+          <w:sz w:val="24"/>
+          <w:szCs w:val="24"/>
+        </w:rPr>
+        <w:t>1</w:t>
+      </w:r>
+      <w:r>
+        <w:rPr>
+          <w:rFonts w:eastAsia="Times New Roman" w:cs="Times New Roman" w:ascii="Times New Roman" w:hAnsi="Times New Roman"/>
+          <w:sz w:val="24"/>
+          <w:szCs w:val="24"/>
+        </w:rPr>
+        <w:t xml:space="preserve">] </w:t>
+      </w:r>
+      <w:r>
+        <w:rPr>
+          <w:rFonts w:eastAsia="Times New Roman" w:cs="Times New Roman" w:ascii="Times New Roman" w:hAnsi="Times New Roman"/>
+          <w:b/>
+          <w:bCs/>
+          <w:sz w:val="24"/>
+          <w:szCs w:val="24"/>
+        </w:rPr>
+        <w:t xml:space="preserve">Dawson, T. W. </w:t>
+      </w:r>
+      <w:r>
+        <w:rPr>
+          <w:rFonts w:eastAsia="Times New Roman" w:cs="Times New Roman" w:ascii="Times New Roman" w:hAnsi="Times New Roman"/>
+          <w:sz w:val="24"/>
+          <w:szCs w:val="24"/>
+        </w:rPr>
+        <w:t>(</w:t>
+      </w:r>
+      <w:r>
+        <w:rPr>
+          <w:rFonts w:eastAsia="Times New Roman" w:cs="Times New Roman" w:ascii="Times New Roman" w:hAnsi="Times New Roman"/>
+          <w:sz w:val="24"/>
+          <w:szCs w:val="24"/>
+        </w:rPr>
+        <w:t>accepted</w:t>
+      </w:r>
+      <w:r>
+        <w:rPr>
+          <w:rFonts w:eastAsia="Times New Roman" w:cs="Times New Roman" w:ascii="Times New Roman" w:hAnsi="Times New Roman"/>
+          <w:sz w:val="24"/>
+          <w:szCs w:val="24"/>
+        </w:rPr>
+        <w:t xml:space="preserve">). </w:t>
+      </w:r>
+      <w:r>
+        <w:rPr>
+          <w:rFonts w:eastAsia="Times New Roman" w:cs="Times New Roman" w:ascii="Times New Roman" w:hAnsi="Times New Roman"/>
+          <w:sz w:val="24"/>
+          <w:szCs w:val="24"/>
+        </w:rPr>
+        <w:t xml:space="preserve">The </w:t>
+      </w:r>
+      <w:r>
+        <w:rPr>
+          <w:rFonts w:eastAsia="Times New Roman" w:cs="Times New Roman" w:ascii="Times New Roman" w:hAnsi="Times New Roman"/>
+          <w:sz w:val="24"/>
+          <w:szCs w:val="24"/>
+        </w:rPr>
+        <w:t xml:space="preserve">Nevada Forward </w:t>
+      </w:r>
+      <w:r>
+        <w:rPr>
+          <w:rFonts w:eastAsia="Times New Roman" w:cs="Times New Roman" w:ascii="Times New Roman" w:hAnsi="Times New Roman"/>
+          <w:sz w:val="24"/>
+          <w:szCs w:val="24"/>
+        </w:rPr>
+        <w:t>Initiative:</w:t>
+      </w:r>
+      <w:r>
+        <w:rPr>
+          <w:rFonts w:eastAsia="Times New Roman" w:cs="Times New Roman" w:ascii="Times New Roman" w:hAnsi="Times New Roman"/>
+          <w:sz w:val="24"/>
+          <w:szCs w:val="24"/>
+        </w:rPr>
+        <w:t xml:space="preserve"> A Workforce-Embedded Pathway for Nontraditional and Rural Learners. </w:t>
+      </w:r>
+      <w:r>
+        <w:rPr>
+          <w:rFonts w:eastAsia="Times New Roman" w:cs="Times New Roman" w:ascii="Times New Roman" w:hAnsi="Times New Roman"/>
+          <w:sz w:val="24"/>
+          <w:szCs w:val="24"/>
+        </w:rPr>
+        <w:t>Proposal accepted for presentation at the 88</w:t>
+      </w:r>
+      <w:r>
+        <w:rPr>
+          <w:rFonts w:eastAsia="Times New Roman" w:cs="Times New Roman" w:ascii="Times New Roman" w:hAnsi="Times New Roman"/>
+          <w:sz w:val="24"/>
+          <w:szCs w:val="24"/>
+          <w:vertAlign w:val="superscript"/>
+        </w:rPr>
+        <w:t>th</w:t>
+      </w:r>
+      <w:r>
+        <w:rPr>
+          <w:rFonts w:eastAsia="Times New Roman" w:cs="Times New Roman" w:ascii="Times New Roman" w:hAnsi="Times New Roman"/>
+          <w:sz w:val="24"/>
+          <w:szCs w:val="24"/>
+        </w:rPr>
+        <w:t xml:space="preserve"> Annual Association for Continuing Higher Education (ACHE) Conference, Norfolk, VA. </w:t>
+      </w:r>
+    </w:p>
+    <w:p>
+      <w:pPr>
+        <w:pStyle w:val="Normal"/>
+        <w:spacing w:lineRule="auto" w:line="240" w:before="240" w:after="240"/>
+        <w:ind w:hanging="450" w:start="450"/>
+        <w:rPr>
+          <w:rFonts w:ascii="Times New Roman" w:hAnsi="Times New Roman" w:eastAsia="Times New Roman" w:cs="Times New Roman"/>
+          <w:sz w:val="24"/>
+          <w:szCs w:val="24"/>
+        </w:rPr>
+      </w:pPr>
+      <w:r>
+        <w:rPr>
+          <w:rFonts w:eastAsia="Times New Roman" w:cs="Times New Roman" w:ascii="Times New Roman" w:hAnsi="Times New Roman"/>
+          <w:sz w:val="24"/>
+          <w:szCs w:val="24"/>
+        </w:rPr>
         <w:t xml:space="preserve">[20] </w:t>
       </w:r>
       <w:r>
@@ -3032,7 +3091,32 @@
           <w:sz w:val="24"/>
           <w:szCs w:val="24"/>
         </w:rPr>
-        <w:t xml:space="preserve"> (2026). A Pilot Study Exploring Attitudinal Dimensions in Community College Computer Science: Evidence from Exploratory Factor Analysis. Poster presented at the 57th ACM Technical Symposium on Computer Science Education (SIGCSE), St. Louis, MO. </w:t>
+        <w:t xml:space="preserve"> (2026). A Pilot Study Exploring Attitudinal Dimensions in Community College Computer Science: Evidence from Exploratory Factor Analysis. Poster presented at the 5</w:t>
+      </w:r>
+      <w:r>
+        <w:rPr>
+          <w:rFonts w:eastAsia="Times New Roman" w:cs="Times New Roman" w:ascii="Times New Roman" w:hAnsi="Times New Roman"/>
+          <w:sz w:val="24"/>
+          <w:szCs w:val="24"/>
+        </w:rPr>
+        <w:t>7</w:t>
+      </w:r>
+      <w:r>
+        <w:rPr>
+          <w:rFonts w:eastAsia="Times New Roman" w:cs="Times New Roman" w:ascii="Times New Roman" w:hAnsi="Times New Roman"/>
+          <w:sz w:val="24"/>
+          <w:szCs w:val="24"/>
+          <w:vertAlign w:val="superscript"/>
+        </w:rPr>
+        <w:t>th</w:t>
+      </w:r>
+      <w:r>
+        <w:rPr>
+          <w:rFonts w:eastAsia="Times New Roman" w:cs="Times New Roman" w:ascii="Times New Roman" w:hAnsi="Times New Roman"/>
+          <w:sz w:val="24"/>
+          <w:szCs w:val="24"/>
+        </w:rPr>
+        <w:t xml:space="preserve"> ACM Technical Symposium on Computer Science Education (SIGCSE), St. Louis, MO. </w:t>
       </w:r>
     </w:p>
     <w:p>

</xml_diff>